<commit_message>
remove sele sys btn
</commit_message>
<xml_diff>
--- a/docs/manager-manual.docx
+++ b/docs/manager-manual.docx
@@ -2389,7 +2389,7 @@
         </w:numPr>
         <w:spacing w:after="0"/>
         <w:rPr>
-          <w:rFonts w:ascii="TH SarabunPSK" w:hAnsi="TH SarabunPSK" w:cs="TH SarabunPSK" w:hint="cs"/>
+          <w:rFonts w:ascii="TH SarabunPSK" w:hAnsi="TH SarabunPSK" w:cs="TH SarabunPSK"/>
           <w:color w:val="auto"/>
           <w:sz w:val="28"/>
           <w:szCs w:val="28"/>
@@ -2406,6 +2406,335 @@
         <w:t>คลิกแถวพนักงานเพื่อดูประวัติการลารายบุคคล</w:t>
       </w:r>
       <w:proofErr w:type="spellEnd"/>
+    </w:p>
+    <w:p>
+      <w:pPr>
+        <w:pStyle w:val="Numbered"/>
+        <w:spacing w:after="0"/>
+        <w:rPr>
+          <w:rFonts w:ascii="TH SarabunPSK" w:hAnsi="TH SarabunPSK" w:cs="TH SarabunPSK" w:hint="cs"/>
+          <w:color w:val="auto"/>
+          <w:sz w:val="20"/>
+        </w:rPr>
+      </w:pPr>
+    </w:p>
+    <w:p>
+      <w:pPr>
+        <w:pStyle w:val="Heading1"/>
+        <w:spacing w:before="0" w:after="0"/>
+        <w:rPr>
+          <w:rFonts w:ascii="TH SarabunPSK" w:hAnsi="TH SarabunPSK" w:cs="TH SarabunPSK" w:hint="cs"/>
+          <w:color w:val="auto"/>
+          <w:szCs w:val="32"/>
+        </w:rPr>
+      </w:pPr>
+      <w:r>
+        <w:rPr>
+          <w:rFonts w:ascii="TH SarabunPSK" w:hAnsi="TH SarabunPSK" w:cs="TH SarabunPSK" w:hint="cs"/>
+          <w:color w:val="auto"/>
+          <w:szCs w:val="32"/>
+        </w:rPr>
+        <w:t xml:space="preserve">5. </w:t>
+      </w:r>
+      <w:proofErr w:type="spellStart"/>
+      <w:r>
+        <w:rPr>
+          <w:rFonts w:ascii="TH SarabunPSK" w:hAnsi="TH SarabunPSK" w:cs="TH SarabunPSK" w:hint="cs"/>
+          <w:color w:val="auto"/>
+          <w:szCs w:val="32"/>
+        </w:rPr>
+        <w:t>ภาพรวม</w:t>
+      </w:r>
+      <w:proofErr w:type="spellEnd"/>
+      <w:r>
+        <w:rPr>
+          <w:rFonts w:ascii="TH SarabunPSK" w:hAnsi="TH SarabunPSK" w:cs="TH SarabunPSK" w:hint="cs"/>
+          <w:color w:val="auto"/>
+          <w:szCs w:val="32"/>
+        </w:rPr>
+        <w:t xml:space="preserve"> (Report)</w:t>
+      </w:r>
+    </w:p>
+    <w:p>
+      <w:pPr>
+        <w:pStyle w:val="BodyText"/>
+        <w:spacing w:after="0"/>
+        <w:rPr>
+          <w:rFonts w:ascii="TH SarabunPSK" w:hAnsi="TH SarabunPSK" w:cs="TH SarabunPSK" w:hint="cs"/>
+          <w:color w:val="auto"/>
+          <w:sz w:val="28"/>
+          <w:szCs w:val="28"/>
+        </w:rPr>
+      </w:pPr>
+      <w:proofErr w:type="spellStart"/>
+      <w:r>
+        <w:rPr>
+          <w:rFonts w:ascii="TH SarabunPSK" w:hAnsi="TH SarabunPSK" w:cs="TH SarabunPSK" w:hint="cs"/>
+          <w:color w:val="auto"/>
+          <w:sz w:val="28"/>
+          <w:szCs w:val="28"/>
+        </w:rPr>
+        <w:t>แท็บภาพรวมช่วยให้</w:t>
+      </w:r>
+      <w:proofErr w:type="spellEnd"/>
+      <w:r>
+        <w:rPr>
+          <w:rFonts w:ascii="TH SarabunPSK" w:hAnsi="TH SarabunPSK" w:cs="TH SarabunPSK" w:hint="cs"/>
+          <w:color w:val="auto"/>
+          <w:sz w:val="28"/>
+          <w:szCs w:val="28"/>
+        </w:rPr>
+        <w:t xml:space="preserve"> Manager </w:t>
+      </w:r>
+      <w:proofErr w:type="spellStart"/>
+      <w:r>
+        <w:rPr>
+          <w:rFonts w:ascii="TH SarabunPSK" w:hAnsi="TH SarabunPSK" w:cs="TH SarabunPSK" w:hint="cs"/>
+          <w:color w:val="auto"/>
+          <w:sz w:val="28"/>
+          <w:szCs w:val="28"/>
+        </w:rPr>
+        <w:t>ตรวจสถานะทีมในภาพรวม</w:t>
+      </w:r>
+      <w:proofErr w:type="spellEnd"/>
+      <w:r>
+        <w:rPr>
+          <w:rFonts w:ascii="TH SarabunPSK" w:hAnsi="TH SarabunPSK" w:cs="TH SarabunPSK" w:hint="cs"/>
+          <w:color w:val="auto"/>
+          <w:sz w:val="28"/>
+          <w:szCs w:val="28"/>
+        </w:rPr>
+        <w:t xml:space="preserve"> </w:t>
+      </w:r>
+      <w:proofErr w:type="spellStart"/>
+      <w:r>
+        <w:rPr>
+          <w:rFonts w:ascii="TH SarabunPSK" w:hAnsi="TH SarabunPSK" w:cs="TH SarabunPSK" w:hint="cs"/>
+          <w:color w:val="auto"/>
+          <w:sz w:val="28"/>
+          <w:szCs w:val="28"/>
+        </w:rPr>
+        <w:t>เช่น</w:t>
+      </w:r>
+      <w:proofErr w:type="spellEnd"/>
+      <w:r>
+        <w:rPr>
+          <w:rFonts w:ascii="TH SarabunPSK" w:hAnsi="TH SarabunPSK" w:cs="TH SarabunPSK" w:hint="cs"/>
+          <w:color w:val="auto"/>
+          <w:sz w:val="28"/>
+          <w:szCs w:val="28"/>
+        </w:rPr>
+        <w:t xml:space="preserve"> </w:t>
+      </w:r>
+      <w:proofErr w:type="spellStart"/>
+      <w:r>
+        <w:rPr>
+          <w:rFonts w:ascii="TH SarabunPSK" w:hAnsi="TH SarabunPSK" w:cs="TH SarabunPSK" w:hint="cs"/>
+          <w:color w:val="auto"/>
+          <w:sz w:val="28"/>
+          <w:szCs w:val="28"/>
+        </w:rPr>
+        <w:t>จำนวนพนักงาน</w:t>
+      </w:r>
+      <w:proofErr w:type="spellEnd"/>
+      <w:r>
+        <w:rPr>
+          <w:rFonts w:ascii="TH SarabunPSK" w:hAnsi="TH SarabunPSK" w:cs="TH SarabunPSK" w:hint="cs"/>
+          <w:color w:val="auto"/>
+          <w:sz w:val="28"/>
+          <w:szCs w:val="28"/>
+        </w:rPr>
+        <w:t xml:space="preserve"> </w:t>
+      </w:r>
+      <w:proofErr w:type="spellStart"/>
+      <w:r>
+        <w:rPr>
+          <w:rFonts w:ascii="TH SarabunPSK" w:hAnsi="TH SarabunPSK" w:cs="TH SarabunPSK" w:hint="cs"/>
+          <w:color w:val="auto"/>
+          <w:sz w:val="28"/>
+          <w:szCs w:val="28"/>
+        </w:rPr>
+        <w:t>คำขอรออนุมัติ</w:t>
+      </w:r>
+      <w:proofErr w:type="spellEnd"/>
+      <w:r>
+        <w:rPr>
+          <w:rFonts w:ascii="TH SarabunPSK" w:hAnsi="TH SarabunPSK" w:cs="TH SarabunPSK" w:hint="cs"/>
+          <w:color w:val="auto"/>
+          <w:sz w:val="28"/>
+          <w:szCs w:val="28"/>
+        </w:rPr>
+        <w:t xml:space="preserve"> </w:t>
+      </w:r>
+      <w:proofErr w:type="spellStart"/>
+      <w:r>
+        <w:rPr>
+          <w:rFonts w:ascii="TH SarabunPSK" w:hAnsi="TH SarabunPSK" w:cs="TH SarabunPSK" w:hint="cs"/>
+          <w:color w:val="auto"/>
+          <w:sz w:val="28"/>
+          <w:szCs w:val="28"/>
+        </w:rPr>
+        <w:t>คำขอล่าสุด</w:t>
+      </w:r>
+      <w:proofErr w:type="spellEnd"/>
+      <w:r>
+        <w:rPr>
+          <w:rFonts w:ascii="TH SarabunPSK" w:hAnsi="TH SarabunPSK" w:cs="TH SarabunPSK" w:hint="cs"/>
+          <w:color w:val="auto"/>
+          <w:sz w:val="28"/>
+          <w:szCs w:val="28"/>
+        </w:rPr>
+        <w:t xml:space="preserve"> </w:t>
+      </w:r>
+      <w:proofErr w:type="spellStart"/>
+      <w:r>
+        <w:rPr>
+          <w:rFonts w:ascii="TH SarabunPSK" w:hAnsi="TH SarabunPSK" w:cs="TH SarabunPSK" w:hint="cs"/>
+          <w:color w:val="auto"/>
+          <w:sz w:val="28"/>
+          <w:szCs w:val="28"/>
+        </w:rPr>
+        <w:t>โครงสร้างทีม</w:t>
+      </w:r>
+      <w:proofErr w:type="spellEnd"/>
+      <w:r>
+        <w:rPr>
+          <w:rFonts w:ascii="TH SarabunPSK" w:hAnsi="TH SarabunPSK" w:cs="TH SarabunPSK" w:hint="cs"/>
+          <w:color w:val="auto"/>
+          <w:sz w:val="28"/>
+          <w:szCs w:val="28"/>
+        </w:rPr>
+        <w:t xml:space="preserve"> </w:t>
+      </w:r>
+      <w:proofErr w:type="spellStart"/>
+      <w:r>
+        <w:rPr>
+          <w:rFonts w:ascii="TH SarabunPSK" w:hAnsi="TH SarabunPSK" w:cs="TH SarabunPSK" w:hint="cs"/>
+          <w:color w:val="auto"/>
+          <w:sz w:val="28"/>
+          <w:szCs w:val="28"/>
+        </w:rPr>
+        <w:t>และพนักงานที่วันลาเหลือน้อย</w:t>
+      </w:r>
+      <w:proofErr w:type="spellEnd"/>
+    </w:p>
+    <w:p>
+      <w:pPr>
+        <w:pStyle w:val="Bullet"/>
+        <w:numPr>
+          <w:ilvl w:val="0"/>
+          <w:numId w:val="1"/>
+        </w:numPr>
+        <w:spacing w:after="0"/>
+        <w:rPr>
+          <w:rFonts w:ascii="TH SarabunPSK" w:hAnsi="TH SarabunPSK" w:cs="TH SarabunPSK" w:hint="cs"/>
+          <w:color w:val="auto"/>
+          <w:sz w:val="28"/>
+          <w:szCs w:val="28"/>
+        </w:rPr>
+      </w:pPr>
+      <w:proofErr w:type="spellStart"/>
+      <w:r>
+        <w:rPr>
+          <w:rFonts w:ascii="TH SarabunPSK" w:hAnsi="TH SarabunPSK" w:cs="TH SarabunPSK" w:hint="cs"/>
+          <w:color w:val="auto"/>
+          <w:sz w:val="28"/>
+          <w:szCs w:val="28"/>
+        </w:rPr>
+        <w:t>ใช้เพื่อดูงานค้างอนุมัติและวางแผนกำลังคน</w:t>
+      </w:r>
+      <w:proofErr w:type="spellEnd"/>
+    </w:p>
+    <w:p>
+      <w:pPr>
+        <w:pStyle w:val="Bullet"/>
+        <w:numPr>
+          <w:ilvl w:val="0"/>
+          <w:numId w:val="1"/>
+        </w:numPr>
+        <w:spacing w:after="0"/>
+        <w:rPr>
+          <w:rFonts w:ascii="TH SarabunPSK" w:hAnsi="TH SarabunPSK" w:cs="TH SarabunPSK" w:hint="cs"/>
+          <w:color w:val="auto"/>
+          <w:sz w:val="28"/>
+          <w:szCs w:val="28"/>
+        </w:rPr>
+      </w:pPr>
+      <w:proofErr w:type="spellStart"/>
+      <w:r>
+        <w:rPr>
+          <w:rFonts w:ascii="TH SarabunPSK" w:hAnsi="TH SarabunPSK" w:cs="TH SarabunPSK" w:hint="cs"/>
+          <w:color w:val="auto"/>
+          <w:sz w:val="28"/>
+          <w:szCs w:val="28"/>
+        </w:rPr>
+        <w:t>ดูสรุปทีมตามหัวหน้าเพื่อเข้าใจภาระงานของแต่ละทีม</w:t>
+      </w:r>
+      <w:proofErr w:type="spellEnd"/>
+    </w:p>
+    <w:p>
+      <w:pPr>
+        <w:pStyle w:val="Bullet"/>
+        <w:numPr>
+          <w:ilvl w:val="0"/>
+          <w:numId w:val="1"/>
+        </w:numPr>
+        <w:spacing w:after="0"/>
+        <w:rPr>
+          <w:rFonts w:ascii="TH SarabunPSK" w:hAnsi="TH SarabunPSK" w:cs="TH SarabunPSK" w:hint="cs"/>
+          <w:color w:val="auto"/>
+          <w:sz w:val="28"/>
+          <w:szCs w:val="28"/>
+        </w:rPr>
+      </w:pPr>
+      <w:proofErr w:type="spellStart"/>
+      <w:r>
+        <w:rPr>
+          <w:rFonts w:ascii="TH SarabunPSK" w:hAnsi="TH SarabunPSK" w:cs="TH SarabunPSK" w:hint="cs"/>
+          <w:color w:val="auto"/>
+          <w:sz w:val="28"/>
+          <w:szCs w:val="28"/>
+        </w:rPr>
+        <w:t>ดูพนักงานที่วันลาเหลือน้อยเพื่อประเมินความเสี่ยงด้านแผนงาน</w:t>
+      </w:r>
+      <w:proofErr w:type="spellEnd"/>
+    </w:p>
+    <w:p>
+      <w:pPr>
+        <w:pStyle w:val="Heading1"/>
+        <w:spacing w:after="0"/>
+        <w:rPr>
+          <w:rFonts w:ascii="TH SarabunPSK" w:hAnsi="TH SarabunPSK" w:cs="TH SarabunPSK" w:hint="cs"/>
+          <w:color w:val="auto"/>
+          <w:szCs w:val="32"/>
+        </w:rPr>
+      </w:pPr>
+      <w:r>
+        <w:rPr>
+          <w:rFonts w:ascii="TH SarabunPSK" w:hAnsi="TH SarabunPSK" w:cs="TH SarabunPSK" w:hint="cs"/>
+          <w:color w:val="auto"/>
+          <w:szCs w:val="32"/>
+        </w:rPr>
+        <w:t xml:space="preserve">6. </w:t>
+      </w:r>
+      <w:proofErr w:type="spellStart"/>
+      <w:r>
+        <w:rPr>
+          <w:rFonts w:ascii="TH SarabunPSK" w:hAnsi="TH SarabunPSK" w:cs="TH SarabunPSK" w:hint="cs"/>
+          <w:color w:val="auto"/>
+          <w:szCs w:val="32"/>
+        </w:rPr>
+        <w:t>การสร้าง</w:t>
+      </w:r>
+      <w:proofErr w:type="spellEnd"/>
+      <w:r>
+        <w:rPr>
+          <w:rFonts w:ascii="TH SarabunPSK" w:hAnsi="TH SarabunPSK" w:cs="TH SarabunPSK" w:hint="cs"/>
+          <w:color w:val="auto"/>
+          <w:szCs w:val="32"/>
+        </w:rPr>
+        <w:t xml:space="preserve"> Event</w:t>
+      </w:r>
     </w:p>
     <w:p>
       <w:pPr>
@@ -2430,7 +2759,43 @@
           <w:sz w:val="28"/>
           <w:szCs w:val="28"/>
         </w:rPr>
-        <w:t>หากมีสิทธิ์</w:t>
+        <w:t>เปิดแท็บ</w:t>
+      </w:r>
+      <w:proofErr w:type="spellEnd"/>
+      <w:r>
+        <w:rPr>
+          <w:rFonts w:ascii="TH SarabunPSK" w:hAnsi="TH SarabunPSK" w:cs="TH SarabunPSK" w:hint="cs"/>
+          <w:color w:val="auto"/>
+          <w:sz w:val="28"/>
+          <w:szCs w:val="28"/>
+        </w:rPr>
+        <w:t xml:space="preserve"> Event</w:t>
+      </w:r>
+    </w:p>
+    <w:p>
+      <w:pPr>
+        <w:pStyle w:val="Numbered"/>
+        <w:numPr>
+          <w:ilvl w:val="0"/>
+          <w:numId w:val="1"/>
+        </w:numPr>
+        <w:spacing w:after="0"/>
+        <w:rPr>
+          <w:rFonts w:ascii="TH SarabunPSK" w:hAnsi="TH SarabunPSK" w:cs="TH SarabunPSK" w:hint="cs"/>
+          <w:color w:val="auto"/>
+          <w:sz w:val="28"/>
+          <w:szCs w:val="28"/>
+        </w:rPr>
+      </w:pPr>
+      <w:proofErr w:type="spellStart"/>
+      <w:r>
+        <w:rPr>
+          <w:rFonts w:ascii="TH SarabunPSK" w:hAnsi="TH SarabunPSK" w:cs="TH SarabunPSK" w:hint="cs"/>
+          <w:color w:val="auto"/>
+          <w:sz w:val="28"/>
+          <w:szCs w:val="28"/>
+        </w:rPr>
+        <w:t>กด</w:t>
       </w:r>
       <w:proofErr w:type="spellEnd"/>
       <w:r>
@@ -2450,49 +2815,211 @@
           <w:sz w:val="28"/>
           <w:szCs w:val="28"/>
         </w:rPr>
-        <w:t>ให้กด</w:t>
-      </w:r>
-      <w:proofErr w:type="spellEnd"/>
-      <w:r>
-        <w:rPr>
-          <w:rFonts w:ascii="TH SarabunPSK" w:hAnsi="TH SarabunPSK" w:cs="TH SarabunPSK" w:hint="cs"/>
-          <w:color w:val="auto"/>
-          <w:sz w:val="28"/>
-          <w:szCs w:val="28"/>
-        </w:rPr>
-        <w:t xml:space="preserve"> </w:t>
-      </w:r>
-      <w:proofErr w:type="spellStart"/>
-      <w:r>
-        <w:rPr>
-          <w:rFonts w:ascii="TH SarabunPSK" w:hAnsi="TH SarabunPSK" w:cs="TH SarabunPSK" w:hint="cs"/>
-          <w:color w:val="auto"/>
-          <w:sz w:val="28"/>
-          <w:szCs w:val="28"/>
-        </w:rPr>
-        <w:t>กำหนดวันลา</w:t>
-      </w:r>
-      <w:proofErr w:type="spellEnd"/>
-      <w:r>
-        <w:rPr>
-          <w:rFonts w:ascii="TH SarabunPSK" w:hAnsi="TH SarabunPSK" w:cs="TH SarabunPSK" w:hint="cs"/>
-          <w:color w:val="auto"/>
-          <w:sz w:val="28"/>
-          <w:szCs w:val="28"/>
-        </w:rPr>
-        <w:t xml:space="preserve"> </w:t>
-      </w:r>
-      <w:proofErr w:type="spellStart"/>
-      <w:r>
-        <w:rPr>
-          <w:rFonts w:ascii="TH SarabunPSK" w:hAnsi="TH SarabunPSK" w:cs="TH SarabunPSK" w:hint="cs"/>
-          <w:color w:val="auto"/>
-          <w:sz w:val="28"/>
-          <w:szCs w:val="28"/>
-        </w:rPr>
-        <w:t>เพื่อปรับสิทธิ์วันลาของพนักงาน</w:t>
-      </w:r>
-      <w:proofErr w:type="spellEnd"/>
+        <w:t>สร้าง</w:t>
+      </w:r>
+      <w:proofErr w:type="spellEnd"/>
+      <w:r>
+        <w:rPr>
+          <w:rFonts w:ascii="TH SarabunPSK" w:hAnsi="TH SarabunPSK" w:cs="TH SarabunPSK" w:hint="cs"/>
+          <w:color w:val="auto"/>
+          <w:sz w:val="28"/>
+          <w:szCs w:val="28"/>
+        </w:rPr>
+        <w:t xml:space="preserve"> Event</w:t>
+      </w:r>
+    </w:p>
+    <w:p>
+      <w:pPr>
+        <w:pStyle w:val="Numbered"/>
+        <w:numPr>
+          <w:ilvl w:val="0"/>
+          <w:numId w:val="1"/>
+        </w:numPr>
+        <w:spacing w:after="0"/>
+        <w:rPr>
+          <w:rFonts w:ascii="TH SarabunPSK" w:hAnsi="TH SarabunPSK" w:cs="TH SarabunPSK" w:hint="cs"/>
+          <w:color w:val="auto"/>
+          <w:sz w:val="28"/>
+          <w:szCs w:val="28"/>
+        </w:rPr>
+      </w:pPr>
+      <w:proofErr w:type="spellStart"/>
+      <w:r>
+        <w:rPr>
+          <w:rFonts w:ascii="TH SarabunPSK" w:hAnsi="TH SarabunPSK" w:cs="TH SarabunPSK" w:hint="cs"/>
+          <w:color w:val="auto"/>
+          <w:sz w:val="28"/>
+          <w:szCs w:val="28"/>
+        </w:rPr>
+        <w:t>กรอกชื่อ</w:t>
+      </w:r>
+      <w:proofErr w:type="spellEnd"/>
+      <w:r>
+        <w:rPr>
+          <w:rFonts w:ascii="TH SarabunPSK" w:hAnsi="TH SarabunPSK" w:cs="TH SarabunPSK" w:hint="cs"/>
+          <w:color w:val="auto"/>
+          <w:sz w:val="28"/>
+          <w:szCs w:val="28"/>
+        </w:rPr>
+        <w:t xml:space="preserve"> Event</w:t>
+      </w:r>
+    </w:p>
+    <w:p>
+      <w:pPr>
+        <w:pStyle w:val="Numbered"/>
+        <w:numPr>
+          <w:ilvl w:val="0"/>
+          <w:numId w:val="1"/>
+        </w:numPr>
+        <w:spacing w:after="0"/>
+        <w:rPr>
+          <w:rFonts w:ascii="TH SarabunPSK" w:hAnsi="TH SarabunPSK" w:cs="TH SarabunPSK" w:hint="cs"/>
+          <w:color w:val="auto"/>
+          <w:sz w:val="28"/>
+          <w:szCs w:val="28"/>
+        </w:rPr>
+      </w:pPr>
+      <w:proofErr w:type="spellStart"/>
+      <w:r>
+        <w:rPr>
+          <w:rFonts w:ascii="TH SarabunPSK" w:hAnsi="TH SarabunPSK" w:cs="TH SarabunPSK" w:hint="cs"/>
+          <w:color w:val="auto"/>
+          <w:sz w:val="28"/>
+          <w:szCs w:val="28"/>
+        </w:rPr>
+        <w:t>เลือกวันที่เริ่มและวันที่สิ้นสุด</w:t>
+      </w:r>
+      <w:proofErr w:type="spellEnd"/>
+    </w:p>
+    <w:p>
+      <w:pPr>
+        <w:pStyle w:val="Numbered"/>
+        <w:numPr>
+          <w:ilvl w:val="0"/>
+          <w:numId w:val="1"/>
+        </w:numPr>
+        <w:spacing w:after="0"/>
+        <w:rPr>
+          <w:rFonts w:ascii="TH SarabunPSK" w:hAnsi="TH SarabunPSK" w:cs="TH SarabunPSK" w:hint="cs"/>
+          <w:color w:val="auto"/>
+          <w:sz w:val="28"/>
+          <w:szCs w:val="28"/>
+        </w:rPr>
+      </w:pPr>
+      <w:proofErr w:type="spellStart"/>
+      <w:r>
+        <w:rPr>
+          <w:rFonts w:ascii="TH SarabunPSK" w:hAnsi="TH SarabunPSK" w:cs="TH SarabunPSK" w:hint="cs"/>
+          <w:color w:val="auto"/>
+          <w:sz w:val="28"/>
+          <w:szCs w:val="28"/>
+        </w:rPr>
+        <w:t>เลือกผู้รับผิดชอบอย่างน้อย</w:t>
+      </w:r>
+      <w:proofErr w:type="spellEnd"/>
+      <w:r>
+        <w:rPr>
+          <w:rFonts w:ascii="TH SarabunPSK" w:hAnsi="TH SarabunPSK" w:cs="TH SarabunPSK" w:hint="cs"/>
+          <w:color w:val="auto"/>
+          <w:sz w:val="28"/>
+          <w:szCs w:val="28"/>
+        </w:rPr>
+        <w:t xml:space="preserve"> 1 </w:t>
+      </w:r>
+      <w:proofErr w:type="spellStart"/>
+      <w:r>
+        <w:rPr>
+          <w:rFonts w:ascii="TH SarabunPSK" w:hAnsi="TH SarabunPSK" w:cs="TH SarabunPSK" w:hint="cs"/>
+          <w:color w:val="auto"/>
+          <w:sz w:val="28"/>
+          <w:szCs w:val="28"/>
+        </w:rPr>
+        <w:t>คนจากรายชื่อ</w:t>
+      </w:r>
+      <w:proofErr w:type="spellEnd"/>
+      <w:r>
+        <w:rPr>
+          <w:rFonts w:ascii="TH SarabunPSK" w:hAnsi="TH SarabunPSK" w:cs="TH SarabunPSK" w:hint="cs"/>
+          <w:color w:val="auto"/>
+          <w:sz w:val="28"/>
+          <w:szCs w:val="28"/>
+        </w:rPr>
+        <w:t xml:space="preserve"> Lead/</w:t>
+      </w:r>
+      <w:proofErr w:type="spellStart"/>
+      <w:r>
+        <w:rPr>
+          <w:rFonts w:ascii="TH SarabunPSK" w:hAnsi="TH SarabunPSK" w:cs="TH SarabunPSK" w:hint="cs"/>
+          <w:color w:val="auto"/>
+          <w:sz w:val="28"/>
+          <w:szCs w:val="28"/>
+        </w:rPr>
+        <w:t>ผู้เกี่ยวข้องที่ระบบแสดง</w:t>
+      </w:r>
+      <w:proofErr w:type="spellEnd"/>
+    </w:p>
+    <w:p>
+      <w:pPr>
+        <w:pStyle w:val="Numbered"/>
+        <w:numPr>
+          <w:ilvl w:val="0"/>
+          <w:numId w:val="1"/>
+        </w:numPr>
+        <w:spacing w:after="0"/>
+        <w:rPr>
+          <w:rFonts w:ascii="TH SarabunPSK" w:hAnsi="TH SarabunPSK" w:cs="TH SarabunPSK" w:hint="cs"/>
+          <w:color w:val="auto"/>
+          <w:sz w:val="28"/>
+          <w:szCs w:val="28"/>
+        </w:rPr>
+      </w:pPr>
+      <w:proofErr w:type="spellStart"/>
+      <w:r>
+        <w:rPr>
+          <w:rFonts w:ascii="TH SarabunPSK" w:hAnsi="TH SarabunPSK" w:cs="TH SarabunPSK" w:hint="cs"/>
+          <w:color w:val="auto"/>
+          <w:sz w:val="28"/>
+          <w:szCs w:val="28"/>
+        </w:rPr>
+        <w:t>กรอกรายละเอียดเพิ่มเติมถ้ามี</w:t>
+      </w:r>
+      <w:proofErr w:type="spellEnd"/>
+    </w:p>
+    <w:p>
+      <w:pPr>
+        <w:pStyle w:val="Numbered"/>
+        <w:numPr>
+          <w:ilvl w:val="0"/>
+          <w:numId w:val="1"/>
+        </w:numPr>
+        <w:spacing w:after="0"/>
+        <w:rPr>
+          <w:rFonts w:ascii="TH SarabunPSK" w:hAnsi="TH SarabunPSK" w:cs="TH SarabunPSK" w:hint="cs"/>
+          <w:color w:val="auto"/>
+          <w:sz w:val="28"/>
+          <w:szCs w:val="28"/>
+        </w:rPr>
+      </w:pPr>
+      <w:proofErr w:type="spellStart"/>
+      <w:r>
+        <w:rPr>
+          <w:rFonts w:ascii="TH SarabunPSK" w:hAnsi="TH SarabunPSK" w:cs="TH SarabunPSK" w:hint="cs"/>
+          <w:color w:val="auto"/>
+          <w:sz w:val="28"/>
+          <w:szCs w:val="28"/>
+        </w:rPr>
+        <w:t>กดบันทึกเพื่อสร้าง</w:t>
+      </w:r>
+      <w:proofErr w:type="spellEnd"/>
+      <w:r>
+        <w:rPr>
+          <w:rFonts w:ascii="TH SarabunPSK" w:hAnsi="TH SarabunPSK" w:cs="TH SarabunPSK" w:hint="cs"/>
+          <w:color w:val="auto"/>
+          <w:sz w:val="28"/>
+          <w:szCs w:val="28"/>
+        </w:rPr>
+        <w:t xml:space="preserve"> Event</w:t>
+      </w:r>
     </w:p>
     <w:tbl>
       <w:tblPr>
@@ -2540,7 +3067,7 @@
                 <w:sz w:val="28"/>
                 <w:szCs w:val="28"/>
               </w:rPr>
-              <w:t>ข้อควรระวังในการกำหนดวันลา</w:t>
+              <w:t>เงื่อนไขสำคัญ</w:t>
             </w:r>
             <w:proofErr w:type="spellEnd"/>
           </w:p>
@@ -2563,7 +3090,59 @@
                 <w:sz w:val="28"/>
                 <w:szCs w:val="28"/>
               </w:rPr>
-              <w:t>ตรวจสอบปีที่กำหนดสิทธิ์ให้ถูกต้อง</w:t>
+              <w:t>ต้องระบุชื่อ</w:t>
+            </w:r>
+            <w:proofErr w:type="spellEnd"/>
+            <w:r>
+              <w:rPr>
+                <w:rFonts w:ascii="TH SarabunPSK" w:hAnsi="TH SarabunPSK" w:cs="TH SarabunPSK" w:hint="cs"/>
+                <w:color w:val="auto"/>
+                <w:sz w:val="28"/>
+                <w:szCs w:val="28"/>
+              </w:rPr>
+              <w:t xml:space="preserve"> Event</w:t>
+            </w:r>
+          </w:p>
+          <w:p>
+            <w:pPr>
+              <w:pStyle w:val="CalloutBody"/>
+              <w:spacing w:after="0"/>
+              <w:rPr>
+                <w:rFonts w:ascii="TH SarabunPSK" w:hAnsi="TH SarabunPSK" w:cs="TH SarabunPSK" w:hint="cs"/>
+                <w:color w:val="auto"/>
+                <w:sz w:val="28"/>
+                <w:szCs w:val="28"/>
+              </w:rPr>
+            </w:pPr>
+            <w:proofErr w:type="spellStart"/>
+            <w:r>
+              <w:rPr>
+                <w:rFonts w:ascii="TH SarabunPSK" w:hAnsi="TH SarabunPSK" w:cs="TH SarabunPSK" w:hint="cs"/>
+                <w:color w:val="auto"/>
+                <w:sz w:val="28"/>
+                <w:szCs w:val="28"/>
+              </w:rPr>
+              <w:t>ต้องเลือกผู้รับผิดชอบอย่างน้อย</w:t>
+            </w:r>
+            <w:proofErr w:type="spellEnd"/>
+            <w:r>
+              <w:rPr>
+                <w:rFonts w:ascii="TH SarabunPSK" w:hAnsi="TH SarabunPSK" w:cs="TH SarabunPSK" w:hint="cs"/>
+                <w:color w:val="auto"/>
+                <w:sz w:val="28"/>
+                <w:szCs w:val="28"/>
+              </w:rPr>
+              <w:t xml:space="preserve"> 1 </w:t>
+            </w:r>
+            <w:proofErr w:type="spellStart"/>
+            <w:r>
+              <w:rPr>
+                <w:rFonts w:ascii="TH SarabunPSK" w:hAnsi="TH SarabunPSK" w:cs="TH SarabunPSK" w:hint="cs"/>
+                <w:color w:val="auto"/>
+                <w:sz w:val="28"/>
+                <w:szCs w:val="28"/>
+              </w:rPr>
+              <w:t>คน</w:t>
             </w:r>
             <w:proofErr w:type="spellEnd"/>
           </w:p>
@@ -2586,50 +3165,7 @@
                 <w:sz w:val="28"/>
                 <w:szCs w:val="28"/>
               </w:rPr>
-              <w:t>ปรับเฉพาะกรณีได้รับอนุมัติจาก</w:t>
-            </w:r>
-            <w:proofErr w:type="spellEnd"/>
-            <w:r>
-              <w:rPr>
-                <w:rFonts w:ascii="TH SarabunPSK" w:hAnsi="TH SarabunPSK" w:cs="TH SarabunPSK" w:hint="cs"/>
-                <w:color w:val="auto"/>
-                <w:sz w:val="28"/>
-                <w:szCs w:val="28"/>
-              </w:rPr>
-              <w:t xml:space="preserve"> HR </w:t>
-            </w:r>
-            <w:proofErr w:type="spellStart"/>
-            <w:r>
-              <w:rPr>
-                <w:rFonts w:ascii="TH SarabunPSK" w:hAnsi="TH SarabunPSK" w:cs="TH SarabunPSK" w:hint="cs"/>
-                <w:color w:val="auto"/>
-                <w:sz w:val="28"/>
-                <w:szCs w:val="28"/>
-              </w:rPr>
-              <w:t>หรือผู้รับผิดชอบนโยบายวันลา</w:t>
-            </w:r>
-            <w:proofErr w:type="spellEnd"/>
-          </w:p>
-          <w:p>
-            <w:pPr>
-              <w:pStyle w:val="CalloutBody"/>
-              <w:spacing w:after="0"/>
-              <w:rPr>
-                <w:rFonts w:ascii="TH SarabunPSK" w:hAnsi="TH SarabunPSK" w:cs="TH SarabunPSK" w:hint="cs"/>
-                <w:color w:val="auto"/>
-                <w:sz w:val="28"/>
-                <w:szCs w:val="28"/>
-              </w:rPr>
-            </w:pPr>
-            <w:proofErr w:type="spellStart"/>
-            <w:r>
-              <w:rPr>
-                <w:rFonts w:ascii="TH SarabunPSK" w:hAnsi="TH SarabunPSK" w:cs="TH SarabunPSK" w:hint="cs"/>
-                <w:color w:val="auto"/>
-                <w:sz w:val="28"/>
-                <w:szCs w:val="28"/>
-              </w:rPr>
-              <w:t>ตรวจยอดหลังบันทึกเพื่อป้องกันการกรอกผิด</w:t>
+              <w:t>วันที่สิ้นสุดต้องไม่น้อยกว่าวันที่เริ่มต้น</w:t>
             </w:r>
             <w:proofErr w:type="spellEnd"/>
           </w:p>
@@ -2652,7 +3188,7 @@
           <w:color w:val="auto"/>
           <w:szCs w:val="32"/>
         </w:rPr>
-        <w:t xml:space="preserve">5. </w:t>
+        <w:t xml:space="preserve">7. </w:t>
       </w:r>
       <w:proofErr w:type="spellStart"/>
       <w:r>
@@ -2661,288 +3197,7 @@
           <w:color w:val="auto"/>
           <w:szCs w:val="32"/>
         </w:rPr>
-        <w:t>ภาพรวม</w:t>
-      </w:r>
-      <w:proofErr w:type="spellEnd"/>
-      <w:r>
-        <w:rPr>
-          <w:rFonts w:ascii="TH SarabunPSK" w:hAnsi="TH SarabunPSK" w:cs="TH SarabunPSK" w:hint="cs"/>
-          <w:color w:val="auto"/>
-          <w:szCs w:val="32"/>
-        </w:rPr>
-        <w:t xml:space="preserve"> (Report)</w:t>
-      </w:r>
-    </w:p>
-    <w:p>
-      <w:pPr>
-        <w:pStyle w:val="BodyText"/>
-        <w:spacing w:after="0"/>
-        <w:rPr>
-          <w:rFonts w:ascii="TH SarabunPSK" w:hAnsi="TH SarabunPSK" w:cs="TH SarabunPSK" w:hint="cs"/>
-          <w:color w:val="auto"/>
-          <w:sz w:val="28"/>
-          <w:szCs w:val="28"/>
-        </w:rPr>
-      </w:pPr>
-      <w:proofErr w:type="spellStart"/>
-      <w:r>
-        <w:rPr>
-          <w:rFonts w:ascii="TH SarabunPSK" w:hAnsi="TH SarabunPSK" w:cs="TH SarabunPSK" w:hint="cs"/>
-          <w:color w:val="auto"/>
-          <w:sz w:val="28"/>
-          <w:szCs w:val="28"/>
-        </w:rPr>
-        <w:t>แท็บภาพรวมช่วยให้</w:t>
-      </w:r>
-      <w:proofErr w:type="spellEnd"/>
-      <w:r>
-        <w:rPr>
-          <w:rFonts w:ascii="TH SarabunPSK" w:hAnsi="TH SarabunPSK" w:cs="TH SarabunPSK" w:hint="cs"/>
-          <w:color w:val="auto"/>
-          <w:sz w:val="28"/>
-          <w:szCs w:val="28"/>
-        </w:rPr>
-        <w:t xml:space="preserve"> Manager </w:t>
-      </w:r>
-      <w:proofErr w:type="spellStart"/>
-      <w:r>
-        <w:rPr>
-          <w:rFonts w:ascii="TH SarabunPSK" w:hAnsi="TH SarabunPSK" w:cs="TH SarabunPSK" w:hint="cs"/>
-          <w:color w:val="auto"/>
-          <w:sz w:val="28"/>
-          <w:szCs w:val="28"/>
-        </w:rPr>
-        <w:t>ตรวจสถานะทีมในภาพรวม</w:t>
-      </w:r>
-      <w:proofErr w:type="spellEnd"/>
-      <w:r>
-        <w:rPr>
-          <w:rFonts w:ascii="TH SarabunPSK" w:hAnsi="TH SarabunPSK" w:cs="TH SarabunPSK" w:hint="cs"/>
-          <w:color w:val="auto"/>
-          <w:sz w:val="28"/>
-          <w:szCs w:val="28"/>
-        </w:rPr>
-        <w:t xml:space="preserve"> </w:t>
-      </w:r>
-      <w:proofErr w:type="spellStart"/>
-      <w:r>
-        <w:rPr>
-          <w:rFonts w:ascii="TH SarabunPSK" w:hAnsi="TH SarabunPSK" w:cs="TH SarabunPSK" w:hint="cs"/>
-          <w:color w:val="auto"/>
-          <w:sz w:val="28"/>
-          <w:szCs w:val="28"/>
-        </w:rPr>
-        <w:t>เช่น</w:t>
-      </w:r>
-      <w:proofErr w:type="spellEnd"/>
-      <w:r>
-        <w:rPr>
-          <w:rFonts w:ascii="TH SarabunPSK" w:hAnsi="TH SarabunPSK" w:cs="TH SarabunPSK" w:hint="cs"/>
-          <w:color w:val="auto"/>
-          <w:sz w:val="28"/>
-          <w:szCs w:val="28"/>
-        </w:rPr>
-        <w:t xml:space="preserve"> </w:t>
-      </w:r>
-      <w:proofErr w:type="spellStart"/>
-      <w:r>
-        <w:rPr>
-          <w:rFonts w:ascii="TH SarabunPSK" w:hAnsi="TH SarabunPSK" w:cs="TH SarabunPSK" w:hint="cs"/>
-          <w:color w:val="auto"/>
-          <w:sz w:val="28"/>
-          <w:szCs w:val="28"/>
-        </w:rPr>
-        <w:t>จำนวนพนักงาน</w:t>
-      </w:r>
-      <w:proofErr w:type="spellEnd"/>
-      <w:r>
-        <w:rPr>
-          <w:rFonts w:ascii="TH SarabunPSK" w:hAnsi="TH SarabunPSK" w:cs="TH SarabunPSK" w:hint="cs"/>
-          <w:color w:val="auto"/>
-          <w:sz w:val="28"/>
-          <w:szCs w:val="28"/>
-        </w:rPr>
-        <w:t xml:space="preserve"> </w:t>
-      </w:r>
-      <w:proofErr w:type="spellStart"/>
-      <w:r>
-        <w:rPr>
-          <w:rFonts w:ascii="TH SarabunPSK" w:hAnsi="TH SarabunPSK" w:cs="TH SarabunPSK" w:hint="cs"/>
-          <w:color w:val="auto"/>
-          <w:sz w:val="28"/>
-          <w:szCs w:val="28"/>
-        </w:rPr>
-        <w:t>คำขอรออนุมัติ</w:t>
-      </w:r>
-      <w:proofErr w:type="spellEnd"/>
-      <w:r>
-        <w:rPr>
-          <w:rFonts w:ascii="TH SarabunPSK" w:hAnsi="TH SarabunPSK" w:cs="TH SarabunPSK" w:hint="cs"/>
-          <w:color w:val="auto"/>
-          <w:sz w:val="28"/>
-          <w:szCs w:val="28"/>
-        </w:rPr>
-        <w:t xml:space="preserve"> </w:t>
-      </w:r>
-      <w:proofErr w:type="spellStart"/>
-      <w:r>
-        <w:rPr>
-          <w:rFonts w:ascii="TH SarabunPSK" w:hAnsi="TH SarabunPSK" w:cs="TH SarabunPSK" w:hint="cs"/>
-          <w:color w:val="auto"/>
-          <w:sz w:val="28"/>
-          <w:szCs w:val="28"/>
-        </w:rPr>
-        <w:t>คำขอล่าสุด</w:t>
-      </w:r>
-      <w:proofErr w:type="spellEnd"/>
-      <w:r>
-        <w:rPr>
-          <w:rFonts w:ascii="TH SarabunPSK" w:hAnsi="TH SarabunPSK" w:cs="TH SarabunPSK" w:hint="cs"/>
-          <w:color w:val="auto"/>
-          <w:sz w:val="28"/>
-          <w:szCs w:val="28"/>
-        </w:rPr>
-        <w:t xml:space="preserve"> </w:t>
-      </w:r>
-      <w:proofErr w:type="spellStart"/>
-      <w:r>
-        <w:rPr>
-          <w:rFonts w:ascii="TH SarabunPSK" w:hAnsi="TH SarabunPSK" w:cs="TH SarabunPSK" w:hint="cs"/>
-          <w:color w:val="auto"/>
-          <w:sz w:val="28"/>
-          <w:szCs w:val="28"/>
-        </w:rPr>
-        <w:t>โครงสร้างทีม</w:t>
-      </w:r>
-      <w:proofErr w:type="spellEnd"/>
-      <w:r>
-        <w:rPr>
-          <w:rFonts w:ascii="TH SarabunPSK" w:hAnsi="TH SarabunPSK" w:cs="TH SarabunPSK" w:hint="cs"/>
-          <w:color w:val="auto"/>
-          <w:sz w:val="28"/>
-          <w:szCs w:val="28"/>
-        </w:rPr>
-        <w:t xml:space="preserve"> </w:t>
-      </w:r>
-      <w:proofErr w:type="spellStart"/>
-      <w:r>
-        <w:rPr>
-          <w:rFonts w:ascii="TH SarabunPSK" w:hAnsi="TH SarabunPSK" w:cs="TH SarabunPSK" w:hint="cs"/>
-          <w:color w:val="auto"/>
-          <w:sz w:val="28"/>
-          <w:szCs w:val="28"/>
-        </w:rPr>
-        <w:t>และพนักงานที่วันลาเหลือน้อย</w:t>
-      </w:r>
-      <w:proofErr w:type="spellEnd"/>
-    </w:p>
-    <w:p>
-      <w:pPr>
-        <w:pStyle w:val="Bullet"/>
-        <w:numPr>
-          <w:ilvl w:val="0"/>
-          <w:numId w:val="1"/>
-        </w:numPr>
-        <w:spacing w:after="0"/>
-        <w:rPr>
-          <w:rFonts w:ascii="TH SarabunPSK" w:hAnsi="TH SarabunPSK" w:cs="TH SarabunPSK" w:hint="cs"/>
-          <w:color w:val="auto"/>
-          <w:sz w:val="28"/>
-          <w:szCs w:val="28"/>
-        </w:rPr>
-      </w:pPr>
-      <w:proofErr w:type="spellStart"/>
-      <w:r>
-        <w:rPr>
-          <w:rFonts w:ascii="TH SarabunPSK" w:hAnsi="TH SarabunPSK" w:cs="TH SarabunPSK" w:hint="cs"/>
-          <w:color w:val="auto"/>
-          <w:sz w:val="28"/>
-          <w:szCs w:val="28"/>
-        </w:rPr>
-        <w:t>ใช้เพื่อดูงานค้างอนุมัติและวางแผนกำลังคน</w:t>
-      </w:r>
-      <w:proofErr w:type="spellEnd"/>
-    </w:p>
-    <w:p>
-      <w:pPr>
-        <w:pStyle w:val="Bullet"/>
-        <w:numPr>
-          <w:ilvl w:val="0"/>
-          <w:numId w:val="1"/>
-        </w:numPr>
-        <w:spacing w:after="0"/>
-        <w:rPr>
-          <w:rFonts w:ascii="TH SarabunPSK" w:hAnsi="TH SarabunPSK" w:cs="TH SarabunPSK" w:hint="cs"/>
-          <w:color w:val="auto"/>
-          <w:sz w:val="28"/>
-          <w:szCs w:val="28"/>
-        </w:rPr>
-      </w:pPr>
-      <w:proofErr w:type="spellStart"/>
-      <w:r>
-        <w:rPr>
-          <w:rFonts w:ascii="TH SarabunPSK" w:hAnsi="TH SarabunPSK" w:cs="TH SarabunPSK" w:hint="cs"/>
-          <w:color w:val="auto"/>
-          <w:sz w:val="28"/>
-          <w:szCs w:val="28"/>
-        </w:rPr>
-        <w:t>ดูสรุปทีมตามหัวหน้าเพื่อเข้าใจภาระงานของแต่ละทีม</w:t>
-      </w:r>
-      <w:proofErr w:type="spellEnd"/>
-    </w:p>
-    <w:p>
-      <w:pPr>
-        <w:pStyle w:val="Bullet"/>
-        <w:numPr>
-          <w:ilvl w:val="0"/>
-          <w:numId w:val="1"/>
-        </w:numPr>
-        <w:spacing w:after="0"/>
-        <w:rPr>
-          <w:rFonts w:ascii="TH SarabunPSK" w:hAnsi="TH SarabunPSK" w:cs="TH SarabunPSK" w:hint="cs"/>
-          <w:color w:val="auto"/>
-          <w:sz w:val="28"/>
-          <w:szCs w:val="28"/>
-        </w:rPr>
-      </w:pPr>
-      <w:proofErr w:type="spellStart"/>
-      <w:r>
-        <w:rPr>
-          <w:rFonts w:ascii="TH SarabunPSK" w:hAnsi="TH SarabunPSK" w:cs="TH SarabunPSK" w:hint="cs"/>
-          <w:color w:val="auto"/>
-          <w:sz w:val="28"/>
-          <w:szCs w:val="28"/>
-        </w:rPr>
-        <w:t>ดูพนักงานที่วันลาเหลือน้อยเพื่อประเมินความเสี่ยงด้านแผนงาน</w:t>
-      </w:r>
-      <w:proofErr w:type="spellEnd"/>
-    </w:p>
-    <w:p>
-      <w:pPr>
-        <w:pStyle w:val="Heading1"/>
-        <w:spacing w:after="0"/>
-        <w:rPr>
-          <w:rFonts w:ascii="TH SarabunPSK" w:hAnsi="TH SarabunPSK" w:cs="TH SarabunPSK" w:hint="cs"/>
-          <w:color w:val="auto"/>
-          <w:szCs w:val="32"/>
-        </w:rPr>
-      </w:pPr>
-      <w:r>
-        <w:rPr>
-          <w:rFonts w:ascii="TH SarabunPSK" w:hAnsi="TH SarabunPSK" w:cs="TH SarabunPSK" w:hint="cs"/>
-          <w:color w:val="auto"/>
-          <w:szCs w:val="32"/>
-        </w:rPr>
-        <w:t xml:space="preserve">6. </w:t>
-      </w:r>
-      <w:proofErr w:type="spellStart"/>
-      <w:r>
-        <w:rPr>
-          <w:rFonts w:ascii="TH SarabunPSK" w:hAnsi="TH SarabunPSK" w:cs="TH SarabunPSK" w:hint="cs"/>
-          <w:color w:val="auto"/>
-          <w:szCs w:val="32"/>
-        </w:rPr>
-        <w:t>การสร้าง</w:t>
+        <w:t>การเลือกผู้เข้าร่วม</w:t>
       </w:r>
       <w:proofErr w:type="spellEnd"/>
       <w:r>
@@ -2977,7 +3232,47 @@
           <w:sz w:val="28"/>
           <w:szCs w:val="28"/>
         </w:rPr>
-        <w:t>เปิดแท็บ</w:t>
+        <w:t>จากรายการ</w:t>
+      </w:r>
+      <w:proofErr w:type="spellEnd"/>
+      <w:r>
+        <w:rPr>
+          <w:rFonts w:ascii="TH SarabunPSK" w:hAnsi="TH SarabunPSK" w:cs="TH SarabunPSK" w:hint="cs"/>
+          <w:color w:val="auto"/>
+          <w:sz w:val="28"/>
+          <w:szCs w:val="28"/>
+        </w:rPr>
+        <w:t xml:space="preserve"> Event </w:t>
+      </w:r>
+      <w:proofErr w:type="spellStart"/>
+      <w:r>
+        <w:rPr>
+          <w:rFonts w:ascii="TH SarabunPSK" w:hAnsi="TH SarabunPSK" w:cs="TH SarabunPSK" w:hint="cs"/>
+          <w:color w:val="auto"/>
+          <w:sz w:val="28"/>
+          <w:szCs w:val="28"/>
+        </w:rPr>
+        <w:t>กด</w:t>
+      </w:r>
+      <w:proofErr w:type="spellEnd"/>
+      <w:r>
+        <w:rPr>
+          <w:rFonts w:ascii="TH SarabunPSK" w:hAnsi="TH SarabunPSK" w:cs="TH SarabunPSK" w:hint="cs"/>
+          <w:color w:val="auto"/>
+          <w:sz w:val="28"/>
+          <w:szCs w:val="28"/>
+        </w:rPr>
+        <w:t xml:space="preserve"> </w:t>
+      </w:r>
+      <w:proofErr w:type="spellStart"/>
+      <w:r>
+        <w:rPr>
+          <w:rFonts w:ascii="TH SarabunPSK" w:hAnsi="TH SarabunPSK" w:cs="TH SarabunPSK" w:hint="cs"/>
+          <w:color w:val="auto"/>
+          <w:sz w:val="28"/>
+          <w:szCs w:val="28"/>
+        </w:rPr>
+        <w:t>เลือกคนเข้า</w:t>
       </w:r>
       <w:proofErr w:type="spellEnd"/>
       <w:r>
@@ -3013,520 +3308,7 @@
           <w:sz w:val="28"/>
           <w:szCs w:val="28"/>
         </w:rPr>
-        <w:t>กด</w:t>
-      </w:r>
-      <w:proofErr w:type="spellEnd"/>
-      <w:r>
-        <w:rPr>
-          <w:rFonts w:ascii="TH SarabunPSK" w:hAnsi="TH SarabunPSK" w:cs="TH SarabunPSK" w:hint="cs"/>
-          <w:color w:val="auto"/>
-          <w:sz w:val="28"/>
-          <w:szCs w:val="28"/>
-        </w:rPr>
-        <w:t xml:space="preserve"> </w:t>
-      </w:r>
-      <w:proofErr w:type="spellStart"/>
-      <w:r>
-        <w:rPr>
-          <w:rFonts w:ascii="TH SarabunPSK" w:hAnsi="TH SarabunPSK" w:cs="TH SarabunPSK" w:hint="cs"/>
-          <w:color w:val="auto"/>
-          <w:sz w:val="28"/>
-          <w:szCs w:val="28"/>
-        </w:rPr>
-        <w:t>สร้าง</w:t>
-      </w:r>
-      <w:proofErr w:type="spellEnd"/>
-      <w:r>
-        <w:rPr>
-          <w:rFonts w:ascii="TH SarabunPSK" w:hAnsi="TH SarabunPSK" w:cs="TH SarabunPSK" w:hint="cs"/>
-          <w:color w:val="auto"/>
-          <w:sz w:val="28"/>
-          <w:szCs w:val="28"/>
-        </w:rPr>
-        <w:t xml:space="preserve"> Event</w:t>
-      </w:r>
-    </w:p>
-    <w:p>
-      <w:pPr>
-        <w:pStyle w:val="Numbered"/>
-        <w:numPr>
-          <w:ilvl w:val="0"/>
-          <w:numId w:val="1"/>
-        </w:numPr>
-        <w:spacing w:after="0"/>
-        <w:rPr>
-          <w:rFonts w:ascii="TH SarabunPSK" w:hAnsi="TH SarabunPSK" w:cs="TH SarabunPSK" w:hint="cs"/>
-          <w:color w:val="auto"/>
-          <w:sz w:val="28"/>
-          <w:szCs w:val="28"/>
-        </w:rPr>
-      </w:pPr>
-      <w:proofErr w:type="spellStart"/>
-      <w:r>
-        <w:rPr>
-          <w:rFonts w:ascii="TH SarabunPSK" w:hAnsi="TH SarabunPSK" w:cs="TH SarabunPSK" w:hint="cs"/>
-          <w:color w:val="auto"/>
-          <w:sz w:val="28"/>
-          <w:szCs w:val="28"/>
-        </w:rPr>
-        <w:t>กรอกชื่อ</w:t>
-      </w:r>
-      <w:proofErr w:type="spellEnd"/>
-      <w:r>
-        <w:rPr>
-          <w:rFonts w:ascii="TH SarabunPSK" w:hAnsi="TH SarabunPSK" w:cs="TH SarabunPSK" w:hint="cs"/>
-          <w:color w:val="auto"/>
-          <w:sz w:val="28"/>
-          <w:szCs w:val="28"/>
-        </w:rPr>
-        <w:t xml:space="preserve"> Event</w:t>
-      </w:r>
-    </w:p>
-    <w:p>
-      <w:pPr>
-        <w:pStyle w:val="Numbered"/>
-        <w:numPr>
-          <w:ilvl w:val="0"/>
-          <w:numId w:val="1"/>
-        </w:numPr>
-        <w:spacing w:after="0"/>
-        <w:rPr>
-          <w:rFonts w:ascii="TH SarabunPSK" w:hAnsi="TH SarabunPSK" w:cs="TH SarabunPSK" w:hint="cs"/>
-          <w:color w:val="auto"/>
-          <w:sz w:val="28"/>
-          <w:szCs w:val="28"/>
-        </w:rPr>
-      </w:pPr>
-      <w:proofErr w:type="spellStart"/>
-      <w:r>
-        <w:rPr>
-          <w:rFonts w:ascii="TH SarabunPSK" w:hAnsi="TH SarabunPSK" w:cs="TH SarabunPSK" w:hint="cs"/>
-          <w:color w:val="auto"/>
-          <w:sz w:val="28"/>
-          <w:szCs w:val="28"/>
-        </w:rPr>
-        <w:t>เลือกวันที่เริ่มและวันที่สิ้นสุด</w:t>
-      </w:r>
-      <w:proofErr w:type="spellEnd"/>
-    </w:p>
-    <w:p>
-      <w:pPr>
-        <w:pStyle w:val="Numbered"/>
-        <w:numPr>
-          <w:ilvl w:val="0"/>
-          <w:numId w:val="1"/>
-        </w:numPr>
-        <w:spacing w:after="0"/>
-        <w:rPr>
-          <w:rFonts w:ascii="TH SarabunPSK" w:hAnsi="TH SarabunPSK" w:cs="TH SarabunPSK" w:hint="cs"/>
-          <w:color w:val="auto"/>
-          <w:sz w:val="28"/>
-          <w:szCs w:val="28"/>
-        </w:rPr>
-      </w:pPr>
-      <w:proofErr w:type="spellStart"/>
-      <w:r>
-        <w:rPr>
-          <w:rFonts w:ascii="TH SarabunPSK" w:hAnsi="TH SarabunPSK" w:cs="TH SarabunPSK" w:hint="cs"/>
-          <w:color w:val="auto"/>
-          <w:sz w:val="28"/>
-          <w:szCs w:val="28"/>
-        </w:rPr>
-        <w:t>เลือกผู้รับผิดชอบอย่างน้อย</w:t>
-      </w:r>
-      <w:proofErr w:type="spellEnd"/>
-      <w:r>
-        <w:rPr>
-          <w:rFonts w:ascii="TH SarabunPSK" w:hAnsi="TH SarabunPSK" w:cs="TH SarabunPSK" w:hint="cs"/>
-          <w:color w:val="auto"/>
-          <w:sz w:val="28"/>
-          <w:szCs w:val="28"/>
-        </w:rPr>
-        <w:t xml:space="preserve"> 1 </w:t>
-      </w:r>
-      <w:proofErr w:type="spellStart"/>
-      <w:r>
-        <w:rPr>
-          <w:rFonts w:ascii="TH SarabunPSK" w:hAnsi="TH SarabunPSK" w:cs="TH SarabunPSK" w:hint="cs"/>
-          <w:color w:val="auto"/>
-          <w:sz w:val="28"/>
-          <w:szCs w:val="28"/>
-        </w:rPr>
-        <w:t>คนจากรายชื่อ</w:t>
-      </w:r>
-      <w:proofErr w:type="spellEnd"/>
-      <w:r>
-        <w:rPr>
-          <w:rFonts w:ascii="TH SarabunPSK" w:hAnsi="TH SarabunPSK" w:cs="TH SarabunPSK" w:hint="cs"/>
-          <w:color w:val="auto"/>
-          <w:sz w:val="28"/>
-          <w:szCs w:val="28"/>
-        </w:rPr>
-        <w:t xml:space="preserve"> Lead/</w:t>
-      </w:r>
-      <w:proofErr w:type="spellStart"/>
-      <w:r>
-        <w:rPr>
-          <w:rFonts w:ascii="TH SarabunPSK" w:hAnsi="TH SarabunPSK" w:cs="TH SarabunPSK" w:hint="cs"/>
-          <w:color w:val="auto"/>
-          <w:sz w:val="28"/>
-          <w:szCs w:val="28"/>
-        </w:rPr>
-        <w:t>ผู้เกี่ยวข้องที่ระบบแสดง</w:t>
-      </w:r>
-      <w:proofErr w:type="spellEnd"/>
-    </w:p>
-    <w:p>
-      <w:pPr>
-        <w:pStyle w:val="Numbered"/>
-        <w:numPr>
-          <w:ilvl w:val="0"/>
-          <w:numId w:val="1"/>
-        </w:numPr>
-        <w:spacing w:after="0"/>
-        <w:rPr>
-          <w:rFonts w:ascii="TH SarabunPSK" w:hAnsi="TH SarabunPSK" w:cs="TH SarabunPSK" w:hint="cs"/>
-          <w:color w:val="auto"/>
-          <w:sz w:val="28"/>
-          <w:szCs w:val="28"/>
-        </w:rPr>
-      </w:pPr>
-      <w:proofErr w:type="spellStart"/>
-      <w:r>
-        <w:rPr>
-          <w:rFonts w:ascii="TH SarabunPSK" w:hAnsi="TH SarabunPSK" w:cs="TH SarabunPSK" w:hint="cs"/>
-          <w:color w:val="auto"/>
-          <w:sz w:val="28"/>
-          <w:szCs w:val="28"/>
-        </w:rPr>
-        <w:t>กรอกรายละเอียดเพิ่มเติมถ้ามี</w:t>
-      </w:r>
-      <w:proofErr w:type="spellEnd"/>
-    </w:p>
-    <w:p>
-      <w:pPr>
-        <w:pStyle w:val="Numbered"/>
-        <w:numPr>
-          <w:ilvl w:val="0"/>
-          <w:numId w:val="1"/>
-        </w:numPr>
-        <w:spacing w:after="0"/>
-        <w:rPr>
-          <w:rFonts w:ascii="TH SarabunPSK" w:hAnsi="TH SarabunPSK" w:cs="TH SarabunPSK" w:hint="cs"/>
-          <w:color w:val="auto"/>
-          <w:sz w:val="28"/>
-          <w:szCs w:val="28"/>
-        </w:rPr>
-      </w:pPr>
-      <w:proofErr w:type="spellStart"/>
-      <w:r>
-        <w:rPr>
-          <w:rFonts w:ascii="TH SarabunPSK" w:hAnsi="TH SarabunPSK" w:cs="TH SarabunPSK" w:hint="cs"/>
-          <w:color w:val="auto"/>
-          <w:sz w:val="28"/>
-          <w:szCs w:val="28"/>
-        </w:rPr>
-        <w:t>กดบันทึกเพื่อสร้าง</w:t>
-      </w:r>
-      <w:proofErr w:type="spellEnd"/>
-      <w:r>
-        <w:rPr>
-          <w:rFonts w:ascii="TH SarabunPSK" w:hAnsi="TH SarabunPSK" w:cs="TH SarabunPSK" w:hint="cs"/>
-          <w:color w:val="auto"/>
-          <w:sz w:val="28"/>
-          <w:szCs w:val="28"/>
-        </w:rPr>
-        <w:t xml:space="preserve"> Event</w:t>
-      </w:r>
-    </w:p>
-    <w:tbl>
-      <w:tblPr>
-        <w:tblW w:w="9360" w:type="dxa"/>
-        <w:tblInd w:w="120" w:type="dxa"/>
-        <w:tblBorders>
-          <w:top w:val="single" w:sz="4" w:space="0" w:color="CBD5E1"/>
-          <w:left w:val="single" w:sz="4" w:space="0" w:color="CBD5E1"/>
-          <w:bottom w:val="single" w:sz="4" w:space="0" w:color="CBD5E1"/>
-          <w:right w:val="single" w:sz="4" w:space="0" w:color="CBD5E1"/>
-        </w:tblBorders>
-        <w:tblCellMar>
-          <w:top w:w="160" w:type="dxa"/>
-          <w:left w:w="180" w:type="dxa"/>
-          <w:bottom w:w="160" w:type="dxa"/>
-          <w:right w:w="180" w:type="dxa"/>
-        </w:tblCellMar>
-        <w:tblLook w:val="0000" w:firstRow="0" w:lastRow="0" w:firstColumn="0" w:lastColumn="0" w:noHBand="0" w:noVBand="0"/>
-      </w:tblPr>
-      <w:tblGrid>
-        <w:gridCol w:w="9360"/>
-      </w:tblGrid>
-      <w:tr>
-        <w:tc>
-          <w:tcPr>
-            <w:tcW w:w="9360" w:type="dxa"/>
-            <w:shd w:val="clear" w:color="auto" w:fill="F4F6F9"/>
-          </w:tcPr>
-          <w:p>
-            <w:pPr>
-              <w:pStyle w:val="CalloutTitle"/>
-              <w:spacing w:after="0"/>
-              <w:rPr>
-                <w:rFonts w:ascii="TH SarabunPSK" w:hAnsi="TH SarabunPSK" w:cs="TH SarabunPSK" w:hint="cs"/>
-                <w:color w:val="auto"/>
-                <w:sz w:val="28"/>
-                <w:szCs w:val="28"/>
-              </w:rPr>
-            </w:pPr>
-            <w:proofErr w:type="spellStart"/>
-            <w:r>
-              <w:rPr>
-                <w:rFonts w:ascii="TH SarabunPSK" w:hAnsi="TH SarabunPSK" w:cs="TH SarabunPSK" w:hint="cs"/>
-                <w:color w:val="auto"/>
-                <w:sz w:val="28"/>
-                <w:szCs w:val="28"/>
-              </w:rPr>
-              <w:lastRenderedPageBreak/>
-              <w:t>เงื่อนไขสำคัญ</w:t>
-            </w:r>
-            <w:proofErr w:type="spellEnd"/>
-          </w:p>
-          <w:p>
-            <w:pPr>
-              <w:pStyle w:val="CalloutBody"/>
-              <w:spacing w:after="0"/>
-              <w:rPr>
-                <w:rFonts w:ascii="TH SarabunPSK" w:hAnsi="TH SarabunPSK" w:cs="TH SarabunPSK" w:hint="cs"/>
-                <w:color w:val="auto"/>
-                <w:sz w:val="28"/>
-                <w:szCs w:val="28"/>
-              </w:rPr>
-            </w:pPr>
-            <w:proofErr w:type="spellStart"/>
-            <w:r>
-              <w:rPr>
-                <w:rFonts w:ascii="TH SarabunPSK" w:hAnsi="TH SarabunPSK" w:cs="TH SarabunPSK" w:hint="cs"/>
-                <w:color w:val="auto"/>
-                <w:sz w:val="28"/>
-                <w:szCs w:val="28"/>
-              </w:rPr>
-              <w:t>ต้องระบุชื่อ</w:t>
-            </w:r>
-            <w:proofErr w:type="spellEnd"/>
-            <w:r>
-              <w:rPr>
-                <w:rFonts w:ascii="TH SarabunPSK" w:hAnsi="TH SarabunPSK" w:cs="TH SarabunPSK" w:hint="cs"/>
-                <w:color w:val="auto"/>
-                <w:sz w:val="28"/>
-                <w:szCs w:val="28"/>
-              </w:rPr>
-              <w:t xml:space="preserve"> Event</w:t>
-            </w:r>
-          </w:p>
-          <w:p>
-            <w:pPr>
-              <w:pStyle w:val="CalloutBody"/>
-              <w:spacing w:after="0"/>
-              <w:rPr>
-                <w:rFonts w:ascii="TH SarabunPSK" w:hAnsi="TH SarabunPSK" w:cs="TH SarabunPSK" w:hint="cs"/>
-                <w:color w:val="auto"/>
-                <w:sz w:val="28"/>
-                <w:szCs w:val="28"/>
-              </w:rPr>
-            </w:pPr>
-            <w:proofErr w:type="spellStart"/>
-            <w:r>
-              <w:rPr>
-                <w:rFonts w:ascii="TH SarabunPSK" w:hAnsi="TH SarabunPSK" w:cs="TH SarabunPSK" w:hint="cs"/>
-                <w:color w:val="auto"/>
-                <w:sz w:val="28"/>
-                <w:szCs w:val="28"/>
-              </w:rPr>
-              <w:t>ต้องเลือกผู้รับผิดชอบอย่างน้อย</w:t>
-            </w:r>
-            <w:proofErr w:type="spellEnd"/>
-            <w:r>
-              <w:rPr>
-                <w:rFonts w:ascii="TH SarabunPSK" w:hAnsi="TH SarabunPSK" w:cs="TH SarabunPSK" w:hint="cs"/>
-                <w:color w:val="auto"/>
-                <w:sz w:val="28"/>
-                <w:szCs w:val="28"/>
-              </w:rPr>
-              <w:t xml:space="preserve"> 1 </w:t>
-            </w:r>
-            <w:proofErr w:type="spellStart"/>
-            <w:r>
-              <w:rPr>
-                <w:rFonts w:ascii="TH SarabunPSK" w:hAnsi="TH SarabunPSK" w:cs="TH SarabunPSK" w:hint="cs"/>
-                <w:color w:val="auto"/>
-                <w:sz w:val="28"/>
-                <w:szCs w:val="28"/>
-              </w:rPr>
-              <w:t>คน</w:t>
-            </w:r>
-            <w:proofErr w:type="spellEnd"/>
-          </w:p>
-          <w:p>
-            <w:pPr>
-              <w:pStyle w:val="CalloutBody"/>
-              <w:spacing w:after="0"/>
-              <w:rPr>
-                <w:rFonts w:ascii="TH SarabunPSK" w:hAnsi="TH SarabunPSK" w:cs="TH SarabunPSK" w:hint="cs"/>
-                <w:color w:val="auto"/>
-                <w:sz w:val="28"/>
-                <w:szCs w:val="28"/>
-              </w:rPr>
-            </w:pPr>
-            <w:proofErr w:type="spellStart"/>
-            <w:r>
-              <w:rPr>
-                <w:rFonts w:ascii="TH SarabunPSK" w:hAnsi="TH SarabunPSK" w:cs="TH SarabunPSK" w:hint="cs"/>
-                <w:color w:val="auto"/>
-                <w:sz w:val="28"/>
-                <w:szCs w:val="28"/>
-              </w:rPr>
-              <w:t>วันที่สิ้นสุดต้องไม่น้อยกว่าวันที่เริ่มต้น</w:t>
-            </w:r>
-            <w:proofErr w:type="spellEnd"/>
-          </w:p>
-        </w:tc>
-      </w:tr>
-    </w:tbl>
-    <w:p>
-      <w:pPr>
-        <w:pStyle w:val="Heading1"/>
-        <w:spacing w:after="0"/>
-        <w:rPr>
-          <w:rFonts w:ascii="TH SarabunPSK" w:hAnsi="TH SarabunPSK" w:cs="TH SarabunPSK" w:hint="cs"/>
-          <w:color w:val="auto"/>
-          <w:szCs w:val="32"/>
-        </w:rPr>
-      </w:pPr>
-      <w:r>
-        <w:rPr>
-          <w:rFonts w:ascii="TH SarabunPSK" w:hAnsi="TH SarabunPSK" w:cs="TH SarabunPSK" w:hint="cs"/>
-          <w:color w:val="auto"/>
-          <w:szCs w:val="32"/>
-        </w:rPr>
-        <w:t xml:space="preserve">7. </w:t>
-      </w:r>
-      <w:proofErr w:type="spellStart"/>
-      <w:r>
-        <w:rPr>
-          <w:rFonts w:ascii="TH SarabunPSK" w:hAnsi="TH SarabunPSK" w:cs="TH SarabunPSK" w:hint="cs"/>
-          <w:color w:val="auto"/>
-          <w:szCs w:val="32"/>
-        </w:rPr>
-        <w:t>การเลือกผู้เข้าร่วม</w:t>
-      </w:r>
-      <w:proofErr w:type="spellEnd"/>
-      <w:r>
-        <w:rPr>
-          <w:rFonts w:ascii="TH SarabunPSK" w:hAnsi="TH SarabunPSK" w:cs="TH SarabunPSK" w:hint="cs"/>
-          <w:color w:val="auto"/>
-          <w:szCs w:val="32"/>
-        </w:rPr>
-        <w:t xml:space="preserve"> Event</w:t>
-      </w:r>
-    </w:p>
-    <w:p>
-      <w:pPr>
-        <w:pStyle w:val="Numbered"/>
-        <w:numPr>
-          <w:ilvl w:val="0"/>
-          <w:numId w:val="1"/>
-        </w:numPr>
-        <w:spacing w:after="0"/>
-        <w:rPr>
-          <w:rFonts w:ascii="TH SarabunPSK" w:hAnsi="TH SarabunPSK" w:cs="TH SarabunPSK" w:hint="cs"/>
-          <w:color w:val="auto"/>
-          <w:sz w:val="28"/>
-          <w:szCs w:val="28"/>
-        </w:rPr>
-      </w:pPr>
-      <w:proofErr w:type="spellStart"/>
-      <w:r>
-        <w:rPr>
-          <w:rFonts w:ascii="TH SarabunPSK" w:hAnsi="TH SarabunPSK" w:cs="TH SarabunPSK" w:hint="cs"/>
-          <w:color w:val="auto"/>
-          <w:sz w:val="28"/>
-          <w:szCs w:val="28"/>
-        </w:rPr>
-        <w:t>จากรายการ</w:t>
-      </w:r>
-      <w:proofErr w:type="spellEnd"/>
-      <w:r>
-        <w:rPr>
-          <w:rFonts w:ascii="TH SarabunPSK" w:hAnsi="TH SarabunPSK" w:cs="TH SarabunPSK" w:hint="cs"/>
-          <w:color w:val="auto"/>
-          <w:sz w:val="28"/>
-          <w:szCs w:val="28"/>
-        </w:rPr>
-        <w:t xml:space="preserve"> Event </w:t>
-      </w:r>
-      <w:proofErr w:type="spellStart"/>
-      <w:r>
-        <w:rPr>
-          <w:rFonts w:ascii="TH SarabunPSK" w:hAnsi="TH SarabunPSK" w:cs="TH SarabunPSK" w:hint="cs"/>
-          <w:color w:val="auto"/>
-          <w:sz w:val="28"/>
-          <w:szCs w:val="28"/>
-        </w:rPr>
-        <w:t>กด</w:t>
-      </w:r>
-      <w:proofErr w:type="spellEnd"/>
-      <w:r>
-        <w:rPr>
-          <w:rFonts w:ascii="TH SarabunPSK" w:hAnsi="TH SarabunPSK" w:cs="TH SarabunPSK" w:hint="cs"/>
-          <w:color w:val="auto"/>
-          <w:sz w:val="28"/>
-          <w:szCs w:val="28"/>
-        </w:rPr>
-        <w:t xml:space="preserve"> </w:t>
-      </w:r>
-      <w:proofErr w:type="spellStart"/>
-      <w:r>
-        <w:rPr>
-          <w:rFonts w:ascii="TH SarabunPSK" w:hAnsi="TH SarabunPSK" w:cs="TH SarabunPSK" w:hint="cs"/>
-          <w:color w:val="auto"/>
-          <w:sz w:val="28"/>
-          <w:szCs w:val="28"/>
-        </w:rPr>
-        <w:t>เลือกคนเข้า</w:t>
-      </w:r>
-      <w:proofErr w:type="spellEnd"/>
-      <w:r>
-        <w:rPr>
-          <w:rFonts w:ascii="TH SarabunPSK" w:hAnsi="TH SarabunPSK" w:cs="TH SarabunPSK" w:hint="cs"/>
-          <w:color w:val="auto"/>
-          <w:sz w:val="28"/>
-          <w:szCs w:val="28"/>
-        </w:rPr>
-        <w:t xml:space="preserve"> Event</w:t>
-      </w:r>
-    </w:p>
-    <w:p>
-      <w:pPr>
-        <w:pStyle w:val="Numbered"/>
-        <w:numPr>
-          <w:ilvl w:val="0"/>
-          <w:numId w:val="1"/>
-        </w:numPr>
-        <w:spacing w:after="0"/>
-        <w:rPr>
-          <w:rFonts w:ascii="TH SarabunPSK" w:hAnsi="TH SarabunPSK" w:cs="TH SarabunPSK" w:hint="cs"/>
-          <w:color w:val="auto"/>
-          <w:sz w:val="28"/>
-          <w:szCs w:val="28"/>
-        </w:rPr>
-      </w:pPr>
-      <w:proofErr w:type="spellStart"/>
-      <w:r>
-        <w:rPr>
-          <w:rFonts w:ascii="TH SarabunPSK" w:hAnsi="TH SarabunPSK" w:cs="TH SarabunPSK" w:hint="cs"/>
-          <w:color w:val="auto"/>
-          <w:sz w:val="28"/>
-          <w:szCs w:val="28"/>
-        </w:rPr>
+        <w:lastRenderedPageBreak/>
         <w:t>ระบบจะแสดงสมาชิกจากทีมของผู้รับผิดชอบ</w:t>
       </w:r>
       <w:proofErr w:type="spellEnd"/>
@@ -4525,7 +4307,6 @@
           <w:color w:val="auto"/>
           <w:szCs w:val="32"/>
         </w:rPr>
-        <w:lastRenderedPageBreak/>
         <w:t xml:space="preserve">9. </w:t>
       </w:r>
       <w:proofErr w:type="spellStart"/>
@@ -4965,6 +4746,7 @@
           <w:sz w:val="28"/>
           <w:szCs w:val="28"/>
         </w:rPr>
+        <w:lastRenderedPageBreak/>
         <w:t>ก่อนลบ</w:t>
       </w:r>
       <w:proofErr w:type="spellEnd"/>

</xml_diff>